<commit_message>
Expand handbook with step-by-step how-to for every major feature
Co-authored-by: Cursor <cursoragent@cursor.com>
</commit_message>
<xml_diff>
--- a/docs/VigilAI_Application_Handbook.docx
+++ b/docs/VigilAI_Application_Handbook.docx
@@ -1460,7 +1460,127 @@
           <w:sz w:val="36"/>
           <w:rFonts w:ascii="Calibri" w:hAnsi="Calibri"/>
         </w:rPr>
-        <w:t>7. Feature catalog (highlights)</w:t>
+        <w:t>7. How to use each feature (step by step)</w:t>
+      </w:r>
+    </w:p>
+    <w:p>
+      <w:pPr>
+        <w:spacing w:after="120" w:before="0" w:line="240" w:lineRule="auto"/>
+      </w:pPr>
+      <w:r>
+        <w:rPr>
+          <w:rFonts w:ascii="Calibri" w:hAnsi="Calibri"/>
+          <w:b w:val="0"/>
+          <w:color w:val="1E293B"/>
+          <w:sz w:val="22"/>
+          <w:rFonts w:ascii="Calibri" w:hAnsi="Calibri"/>
+        </w:rPr>
+        <w:t>Full click-by-click recipes for every hub live in the markdown handbook §7 (Dashboard, Detect, Signal Detail, Workflow, Alerts, Remine, Risk, DDI, Pregnancy, SMQ, Class, Vaccine, Geo, vs FAERS, Graph, Projects/keywords, Pathfinder, Sources, Forge, Users, plus a 10-minute hero script). Summary of the operating pattern:</w:t>
+      </w:r>
+    </w:p>
+    <w:p>
+      <w:pPr>
+        <w:spacing w:after="40" w:before="0" w:line="240" w:lineRule="auto"/>
+      </w:pPr>
+      <w:r>
+        <w:rPr>
+          <w:rFonts w:ascii="Calibri" w:hAnsi="Calibri"/>
+          <w:b w:val="0"/>
+          <w:color w:val="1E293B"/>
+          <w:sz w:val="22"/>
+          <w:rFonts w:ascii="Calibri" w:hAnsi="Calibri"/>
+        </w:rPr>
+        <w:t>• Detect: search product → open row → read briefing first.</w:t>
+      </w:r>
+    </w:p>
+    <w:p>
+      <w:pPr>
+        <w:spacing w:after="40" w:before="0" w:line="240" w:lineRule="auto"/>
+      </w:pPr>
+      <w:r>
+        <w:rPr>
+          <w:rFonts w:ascii="Calibri" w:hAnsi="Calibri"/>
+          <w:b w:val="0"/>
+          <w:color w:val="1E293B"/>
+          <w:sz w:val="22"/>
+          <w:rFonts w:ascii="Calibri" w:hAnsi="Calibri"/>
+        </w:rPr>
+        <w:t>• Remine lab: filter Needs review → Run remine → judge threshold crossing, not raw PRR rise.</w:t>
+      </w:r>
+    </w:p>
+    <w:p>
+      <w:pPr>
+        <w:spacing w:after="40" w:before="0" w:line="240" w:lineRule="auto"/>
+      </w:pPr>
+      <w:r>
+        <w:rPr>
+          <w:rFonts w:ascii="Calibri" w:hAnsi="Calibri"/>
+          <w:b w:val="0"/>
+          <w:color w:val="1E293B"/>
+          <w:sz w:val="22"/>
+          <w:rFonts w:ascii="Calibri" w:hAnsi="Calibri"/>
+        </w:rPr>
+        <w:t>• Lenses (DDI/Pregnancy/SMQ/…): open tab → follow Open signal / Find in Detect.</w:t>
+      </w:r>
+    </w:p>
+    <w:p>
+      <w:pPr>
+        <w:spacing w:after="40" w:before="0" w:line="240" w:lineRule="auto"/>
+      </w:pPr>
+      <w:r>
+        <w:rPr>
+          <w:rFonts w:ascii="Calibri" w:hAnsi="Calibri"/>
+          <w:b w:val="0"/>
+          <w:color w:val="1E293B"/>
+          <w:sz w:val="22"/>
+          <w:rFonts w:ascii="Calibri" w:hAnsi="Calibri"/>
+        </w:rPr>
+        <w:t>• Projects: pick a keyword pack → Create → header switcher → Pathfinder → Fill/Fetch.</w:t>
+      </w:r>
+    </w:p>
+    <w:p>
+      <w:pPr>
+        <w:spacing w:after="40" w:before="0" w:line="240" w:lineRule="auto"/>
+      </w:pPr>
+      <w:r>
+        <w:rPr>
+          <w:rFonts w:ascii="Calibri" w:hAnsi="Calibri"/>
+          <w:b w:val="0"/>
+          <w:color w:val="1E293B"/>
+          <w:sz w:val="22"/>
+          <w:rFonts w:ascii="Calibri" w:hAnsi="Calibri"/>
+        </w:rPr>
+        <w:t>• Sources: Load PV demo pack once when Remine/DDI/Pregnancy look empty.</w:t>
+      </w:r>
+    </w:p>
+    <w:p>
+      <w:pPr>
+        <w:spacing w:after="40" w:before="0" w:line="240" w:lineRule="auto"/>
+      </w:pPr>
+      <w:r>
+        <w:rPr>
+          <w:rFonts w:ascii="Calibri" w:hAnsi="Calibri"/>
+          <w:b w:val="0"/>
+          <w:color w:val="1E293B"/>
+          <w:sz w:val="22"/>
+          <w:rFonts w:ascii="Calibri" w:hAnsi="Calibri"/>
+        </w:rPr>
+        <w:t>• Exports: SAR / E2B / CIOMS from Signal Detail — demo templates only.</w:t>
+      </w:r>
+    </w:p>
+    <w:p>
+      <w:pPr>
+        <w:spacing w:before="280" w:after="120"/>
+      </w:pPr>
+      <w:r>
+        <w:rPr>
+          <w:rFonts w:ascii="Calibri" w:hAnsi="Calibri"/>
+          <w:b/>
+          <w:color w:val="0F2C59"/>
+          <w:sz w:val="36"/>
+          <w:rFonts w:ascii="Calibri" w:hAnsi="Calibri"/>
+        </w:rPr>
+        <w:t>8. Feature catalog (highlights)</w:t>
       </w:r>
     </w:p>
     <w:tbl>
@@ -1870,7 +1990,7 @@
           <w:sz w:val="36"/>
           <w:rFonts w:ascii="Calibri" w:hAnsi="Calibri"/>
         </w:rPr>
-        <w:t>8. Signal science (cheat sheet)</w:t>
+        <w:t>9. Signal science (cheat sheet)</w:t>
       </w:r>
     </w:p>
     <w:tbl>
@@ -2166,7 +2286,7 @@
           <w:sz w:val="36"/>
           <w:rFonts w:ascii="Calibri" w:hAnsi="Calibri"/>
         </w:rPr>
-        <w:t>9. Project keywords — why they matter</w:t>
+        <w:t>10. Project keywords — why they matter</w:t>
       </w:r>
     </w:p>
     <w:p>
@@ -2196,7 +2316,7 @@
           <w:sz w:val="36"/>
           <w:rFonts w:ascii="Calibri" w:hAnsi="Calibri"/>
         </w:rPr>
-        <w:t>10. Compiled keyword packs (copy/paste)</w:t>
+        <w:t>11. Compiled keyword packs (copy/paste)</w:t>
       </w:r>
     </w:p>
     <w:tbl>

</xml_diff>